<commit_message>
Memo: drop financial summary and Rule-of-x, sharpen GRR downsell callout
BSP knows the financials, so the summary bullet is gone (replaced with a
one-liner) and all Rule-of-60/40 references removed. Retention bullet now leads
with the read: 98% logo vs 81% GRR looks like a lot of downsell; management
question is what's shrinking and why. Docx regenerated to match.

Co-Authored-By: Claude Opus 4.8 <noreply@anthropic.com>
Claude-Session: https://claude.ai/code/session_01H4hv2bKhmhU3Wrfiddbnhb
</commit_message>
<xml_diff>
--- a/tcn-ai-demo/teton-memo.docx
+++ b/tcn-ai-demo/teton-memo.docx
@@ -274,19 +274,10 @@
       <w:r>
         <w:rPr>
           <w:rFonts w:ascii="Calibri" w:hAnsi="Calibri"/>
-          <w:b/>
           <w:color w:val="1B2430"/>
           <w:sz w:val="21"/>
         </w:rPr>
-        <w:t>~$60M ARR, ~37% 2026E growth, ~20-24% EBITDA.</w:t>
-      </w:r>
-      <w:r>
-        <w:rPr>
-          <w:rFonts w:ascii="Calibri" w:hAnsi="Calibri"/>
-          <w:color w:val="1B2430"/>
-          <w:sz w:val="21"/>
-        </w:rPr>
-        <w:t xml:space="preserve"> Bootstrapped, clears Rule of 40. (Their “Rule of 60” is a 2026 projection, not a trailing number.) This is a good business.</w:t>
+        <w:t>The core business is healthy and bootstrapped. You've seen the financials; I won't repeat them.</w:t>
       </w:r>
     </w:p>
     <w:p>
@@ -300,7 +291,7 @@
           <w:color w:val="1B2430"/>
           <w:sz w:val="21"/>
         </w:rPr>
-        <w:t>Sticky-ish. ~98% logo retention and a dialer that's hard to rip out. But they also report 81% gross revenue retention, and those two numbers don't fit together in my head. That's a management question.</w:t>
+        <w:t>Sticky-ish. 98% logo retention, but GRR is 81%. Logos stay while revenue shrinks, which reads like a lot of downsell to me. Management question: what's shrinking, and why?</w:t>
       </w:r>
     </w:p>
     <w:p>
@@ -323,7 +314,7 @@
           <w:color w:val="1B2430"/>
           <w:sz w:val="21"/>
         </w:rPr>
-        <w:t xml:space="preserve"> Nearly everything is billed per minute or per message, and their AI Voice is priced at $0.20-0.50/min vs ~$0.05 for a human call. So the AI plan is literally trading phone minutes for AI-agent minutes at 4-10x. If the call stays on their pipes they make more per minute. If it leaves, they make nothing.</w:t>
+        <w:t xml:space="preserve"> Nearly everything bills per minute or per message. AI Voice is priced at $0.20-0.50/min vs ~$0.05 human, so the AI plan is trading phone minutes for AI minutes at 4-10x. On their pipes, they make more per minute. Off their pipes, they make nothing.</w:t>
       </w:r>
     </w:p>
     <w:p>
@@ -589,7 +580,7 @@
           <w:color w:val="1B2430"/>
           <w:sz w:val="21"/>
         </w:rPr>
-        <w:t xml:space="preserve"> They're far behind, and the AI-natives can pull call volume out of the base during the loan term. Monitor dial-path volume and AI-native displacement. One question decides it: </w:t>
+        <w:t xml:space="preserve"> They're far behind, and the AI-natives can pull call volume out of the base during the loan term. Monitor dial-path volume and displacement. One question decides it: </w:t>
       </w:r>
       <w:r>
         <w:rPr>

</xml_diff>